<commit_message>
Auto save docs: WM Montagens Industriais/_qrcodes/nr 18 (08) (WM)_qrcode.png
</commit_message>
<xml_diff>
--- a/WM Montagens Industriais/nr 18 (08) (WM).docx
+++ b/WM Montagens Industriais/nr 18 (08) (WM).docx
@@ -218,32 +218,28 @@
                 <w:sz w:val="26"/>
                 <w:szCs w:val="26"/>
               </w:rPr>
-              <w:t>Obteve aproveitamento satisfatório no curso de capacitação em</w:t>
+              <w:t>Colaborador da empresa1, o</w:t>
             </w:r>
             <w:r>
               <w:rPr>
                 <w:sz w:val="26"/>
                 <w:szCs w:val="26"/>
               </w:rPr>
-              <w:t xml:space="preserve"> </w:t>
-            </w:r>
-            <w:r>
-              <w:rPr>
-                <w:b/>
-                <w:bCs/>
+              <w:t xml:space="preserve">bteve </w:t>
+            </w:r>
+            <w:r>
+              <w:rPr>
                 <w:sz w:val="26"/>
                 <w:szCs w:val="26"/>
               </w:rPr>
-              <w:t>“</w:t>
-            </w:r>
-            <w:r>
-              <w:rPr>
-                <w:b/>
-                <w:bCs/>
+              <w:t>aproveitamento satisfatório no curso de capacitação em</w:t>
+            </w:r>
+            <w:r>
+              <w:rPr>
                 <w:sz w:val="26"/>
                 <w:szCs w:val="26"/>
               </w:rPr>
-              <w:t>CONDIÇÕES E MEIO AMBIENTE DE TRABALHO NA CONSTRUÇÃO CIVIL</w:t>
+              <w:t xml:space="preserve"> </w:t>
             </w:r>
             <w:r>
               <w:rPr>
@@ -252,87 +248,89 @@
                 <w:sz w:val="26"/>
                 <w:szCs w:val="26"/>
               </w:rPr>
-              <w:t>”</w:t>
-            </w:r>
-            <w:r>
-              <w:rPr>
+              <w:t>“</w:t>
+            </w:r>
+            <w:r>
+              <w:rPr>
+                <w:b/>
+                <w:bCs/>
                 <w:sz w:val="26"/>
                 <w:szCs w:val="26"/>
               </w:rPr>
-              <w:t>.</w:t>
-            </w:r>
-            <w:r>
-              <w:t xml:space="preserve"> </w:t>
-            </w:r>
-            <w:r>
-              <w:t>Aplicado</w:t>
-            </w:r>
-            <w:r>
-              <w:rPr>
+              <w:t xml:space="preserve">NR 18 - </w:t>
+            </w:r>
+            <w:r>
+              <w:rPr>
+                <w:b/>
+                <w:bCs/>
                 <w:sz w:val="26"/>
                 <w:szCs w:val="26"/>
               </w:rPr>
-              <w:t xml:space="preserve"> </w:t>
-            </w:r>
-            <w:r>
-              <w:rPr>
+              <w:t>CONDIÇÕES E MEIO AMBIENTE DE TRABALHO NA CONSTRUÇÃO CIVIL</w:t>
+            </w:r>
+            <w:r>
+              <w:rPr>
+                <w:b/>
+                <w:bCs/>
                 <w:sz w:val="26"/>
                 <w:szCs w:val="26"/>
               </w:rPr>
-              <w:t xml:space="preserve">conforme </w:t>
+              <w:t>”</w:t>
             </w:r>
             <w:r>
               <w:rPr>
                 <w:sz w:val="26"/>
                 <w:szCs w:val="26"/>
               </w:rPr>
-              <w:t xml:space="preserve">as exigências da NR 18, item 18.28.2, Portaria </w:t>
-            </w:r>
-            <w:proofErr w:type="spellStart"/>
+              <w:t>.</w:t>
+            </w:r>
+            <w:r>
+              <w:t xml:space="preserve"> </w:t>
+            </w:r>
+            <w:r>
+              <w:t>Aplicado</w:t>
+            </w:r>
             <w:r>
               <w:rPr>
                 <w:sz w:val="26"/>
                 <w:szCs w:val="26"/>
               </w:rPr>
-              <w:t>MTb</w:t>
-            </w:r>
-            <w:proofErr w:type="spellEnd"/>
+              <w:t xml:space="preserve"> </w:t>
+            </w:r>
             <w:r>
               <w:rPr>
                 <w:sz w:val="26"/>
                 <w:szCs w:val="26"/>
               </w:rPr>
-              <w:t xml:space="preserve"> nº 3.214/1978</w:t>
+              <w:t xml:space="preserve">conforme </w:t>
             </w:r>
             <w:r>
               <w:rPr>
                 <w:sz w:val="26"/>
                 <w:szCs w:val="26"/>
               </w:rPr>
-              <w:t>,</w:t>
+              <w:t>as exigências da NR 18, item 18.28.2, Portaria MTb nº 3.214/1978</w:t>
             </w:r>
             <w:r>
               <w:rPr>
                 <w:sz w:val="26"/>
                 <w:szCs w:val="26"/>
               </w:rPr>
-              <w:t xml:space="preserve"> </w:t>
+              <w:t>,</w:t>
             </w:r>
             <w:r>
               <w:rPr>
                 <w:sz w:val="26"/>
                 <w:szCs w:val="26"/>
               </w:rPr>
-              <w:t xml:space="preserve">com carga horária de </w:t>
-            </w:r>
-            <w:r>
-              <w:rPr>
-                <w:b/>
-                <w:bCs/>
+              <w:t xml:space="preserve"> </w:t>
+            </w:r>
+            <w:r>
+              <w:rPr>
                 <w:sz w:val="26"/>
                 <w:szCs w:val="26"/>
               </w:rPr>
-              <w:t>0</w:t>
+              <w:t xml:space="preserve">com carga horária de </w:t>
             </w:r>
             <w:r>
               <w:rPr>
@@ -341,7 +339,7 @@
                 <w:sz w:val="26"/>
                 <w:szCs w:val="26"/>
               </w:rPr>
-              <w:t>8</w:t>
+              <w:t>0</w:t>
             </w:r>
             <w:r>
               <w:rPr>
@@ -350,72 +348,74 @@
                 <w:sz w:val="26"/>
                 <w:szCs w:val="26"/>
               </w:rPr>
-              <w:t xml:space="preserve"> horas</w:t>
-            </w:r>
-            <w:r>
-              <w:rPr>
+              <w:t>8</w:t>
+            </w:r>
+            <w:r>
+              <w:rPr>
+                <w:b/>
+                <w:bCs/>
                 <w:sz w:val="26"/>
                 <w:szCs w:val="26"/>
               </w:rPr>
-              <w:t xml:space="preserve"> e realizado no dia </w:t>
-            </w:r>
-            <w:r>
-              <w:rPr>
-                <w:b/>
-                <w:bCs/>
+              <w:t xml:space="preserve"> horas</w:t>
+            </w:r>
+            <w:r>
+              <w:rPr>
                 <w:sz w:val="26"/>
                 <w:szCs w:val="26"/>
               </w:rPr>
-              <w:t>fim1</w:t>
-            </w:r>
-            <w:r>
-              <w:rPr>
+              <w:t xml:space="preserve"> e realizado no dia </w:t>
+            </w:r>
+            <w:r>
+              <w:rPr>
+                <w:b/>
+                <w:bCs/>
                 <w:sz w:val="26"/>
                 <w:szCs w:val="26"/>
               </w:rPr>
-              <w:t>,</w:t>
+              <w:t>fim1</w:t>
             </w:r>
             <w:r>
               <w:rPr>
                 <w:sz w:val="26"/>
                 <w:szCs w:val="26"/>
               </w:rPr>
-              <w:t xml:space="preserve"> </w:t>
+              <w:t>,</w:t>
             </w:r>
             <w:r>
               <w:rPr>
                 <w:sz w:val="26"/>
                 <w:szCs w:val="26"/>
               </w:rPr>
-              <w:t>nas dependências da empresa</w:t>
+              <w:t xml:space="preserve"> </w:t>
             </w:r>
             <w:r>
               <w:rPr>
                 <w:sz w:val="26"/>
                 <w:szCs w:val="26"/>
               </w:rPr>
-              <w:t xml:space="preserve"> </w:t>
+              <w:t>nas dependências da empresa</w:t>
             </w:r>
             <w:r>
               <w:rPr>
                 <w:sz w:val="26"/>
                 <w:szCs w:val="26"/>
               </w:rPr>
-              <w:t>empresa1</w:t>
+              <w:t xml:space="preserve"> Projetta Engenharia Consultoria e Treinamentos LTDA</w:t>
             </w:r>
             <w:r>
               <w:rPr>
                 <w:sz w:val="26"/>
                 <w:szCs w:val="26"/>
               </w:rPr>
-              <w:t xml:space="preserve">, localizada na </w:t>
+              <w:t xml:space="preserve">, localizada </w:t>
             </w:r>
             <w:r>
               <w:rPr>
                 <w:sz w:val="26"/>
                 <w:szCs w:val="26"/>
               </w:rPr>
-              <w:t>endereço1.</w:t>
+              <w:t>Av. Sagrado Coração de Jesus, 550, Jd. Boa Vista, Guariba (SP).</w:t>
             </w:r>
           </w:p>
         </w:tc>
@@ -444,7 +444,14 @@
           <w:sz w:val="26"/>
           <w:szCs w:val="26"/>
         </w:rPr>
-        <w:t>cidade1, fim2.</w:t>
+        <w:t>Guariba (SP)</w:t>
+      </w:r>
+      <w:r>
+        <w:rPr>
+          <w:sz w:val="26"/>
+          <w:szCs w:val="26"/>
+        </w:rPr>
+        <w:t>, fim2.</w:t>
       </w:r>
     </w:p>
     <w:p>
@@ -624,7 +631,7 @@
                       <w:noProof/>
                     </w:rPr>
                     <w:drawing>
-                      <wp:anchor distT="0" distB="0" distL="114300" distR="114300" simplePos="0" relativeHeight="251660288" behindDoc="1" locked="0" layoutInCell="1" allowOverlap="0" wp14:anchorId="75EBE35F" wp14:editId="757E9B22">
+                      <wp:anchor distT="0" distB="0" distL="114300" distR="114300" simplePos="0" relativeHeight="251660288" behindDoc="1" locked="0" layoutInCell="1" allowOverlap="0" wp14:anchorId="75EBE35F" wp14:editId="27CD4D5C">
                         <wp:simplePos x="0" y="0"/>
                         <wp:positionH relativeFrom="column">
                           <wp:posOffset>-180975</wp:posOffset>
@@ -1467,7 +1474,7 @@
               </w:numPr>
             </w:pPr>
             <w:r>
-              <w:t>NR 18 e suas normas auxiliares;</w:t>
+              <w:t xml:space="preserve">Objetivo Geral. </w:t>
             </w:r>
           </w:p>
           <w:p>
@@ -1479,7 +1486,7 @@
               </w:numPr>
             </w:pPr>
             <w:r>
-              <w:t>Programa de condições e meio ambiente de trabalho na indústria da construção – PCMAT;</w:t>
+              <w:t xml:space="preserve">Legislação. </w:t>
             </w:r>
           </w:p>
           <w:p>
@@ -1491,7 +1498,7 @@
               </w:numPr>
             </w:pPr>
             <w:r>
-              <w:t>Condições e meio ambiente de trabalho;</w:t>
+              <w:t xml:space="preserve">Treinamento. </w:t>
             </w:r>
           </w:p>
           <w:p>
@@ -1503,7 +1510,7 @@
               </w:numPr>
             </w:pPr>
             <w:r>
-              <w:t>Demolição, escavação, fundação e desmonte de rochas;</w:t>
+              <w:t>Informações sobre as Condições e Meio Ambiente de Trabalho.</w:t>
             </w:r>
           </w:p>
           <w:p>
@@ -1515,7 +1522,7 @@
               </w:numPr>
             </w:pPr>
             <w:r>
-              <w:t>Carpintaria;</w:t>
+              <w:t xml:space="preserve">Riscos Inerentes a Função. </w:t>
             </w:r>
           </w:p>
           <w:p>
@@ -1527,7 +1534,7 @@
               </w:numPr>
             </w:pPr>
             <w:r>
-              <w:t>Armação de aço e estruturas de concreto;</w:t>
+              <w:t>Uso Adequado dos Equipamentos de Proteção Individual (EPI).</w:t>
             </w:r>
           </w:p>
           <w:p>
@@ -1539,7 +1546,7 @@
               </w:numPr>
             </w:pPr>
             <w:r>
-              <w:t>Serviços de impermeabilização;</w:t>
+              <w:t>Informações sobre os Equipamentos de Proteção Coletiva (EPC).</w:t>
             </w:r>
           </w:p>
           <w:p>
@@ -1551,7 +1558,7 @@
               </w:numPr>
             </w:pPr>
             <w:r>
-              <w:t>Escadas, rampas e passarelas;</w:t>
+              <w:t>Procedimento de Emergência.</w:t>
             </w:r>
           </w:p>
           <w:p>
@@ -1563,9 +1570,78 @@
               </w:numPr>
             </w:pPr>
             <w:r>
-              <w:t>Proteção contra quedas;</w:t>
-            </w:r>
-          </w:p>
+              <w:t>Recomendações Gerais</w:t>
+            </w:r>
+            <w:r>
+              <w:t xml:space="preserve">: </w:t>
+            </w:r>
+          </w:p>
+          <w:p>
+            <w:pPr>
+              <w:pStyle w:val="PargrafodaLista"/>
+            </w:pPr>
+            <w:r>
+              <w:t>- E</w:t>
+            </w:r>
+            <w:r>
+              <w:t>quipamento e proteção coletiva existentes no canteiro de obras;</w:t>
+            </w:r>
+          </w:p>
+          <w:p>
+            <w:pPr>
+              <w:pStyle w:val="PargrafodaLista"/>
+            </w:pPr>
+            <w:r>
+              <w:t xml:space="preserve">- O </w:t>
+            </w:r>
+            <w:r>
+              <w:t>PGR do canteiro de obras.</w:t>
+            </w:r>
+          </w:p>
+        </w:tc>
+        <w:tc>
+          <w:tcPr>
+            <w:tcW w:w="7286" w:type="dxa"/>
+          </w:tcPr>
+          <w:p>
+            <w:pPr>
+              <w:rPr>
+                <w:b/>
+                <w:bCs/>
+              </w:rPr>
+            </w:pPr>
+            <w:r>
+              <w:rPr>
+                <w:b/>
+                <w:bCs/>
+              </w:rPr>
+              <w:t>Treinamento Admissional - Conforme Item 18.28.2 Carga horária: 06 horas</w:t>
+            </w:r>
+          </w:p>
+          <w:p>
+            <w:pPr>
+              <w:rPr>
+                <w:b/>
+                <w:bCs/>
+              </w:rPr>
+            </w:pPr>
+          </w:p>
+          <w:p>
+            <w:pPr>
+              <w:rPr>
+                <w:b/>
+                <w:bCs/>
+              </w:rPr>
+            </w:pPr>
+            <w:r>
+              <w:rPr>
+                <w:b/>
+                <w:bCs/>
+              </w:rPr>
+              <w:t>Conteúdo programático:</w:t>
+            </w:r>
+          </w:p>
+          <w:p/>
           <w:p>
             <w:pPr>
               <w:pStyle w:val="PargrafodaLista"/>
@@ -1575,7 +1651,7 @@
               </w:numPr>
             </w:pPr>
             <w:r>
-              <w:t>Máquinas, equipamentos e ferramentas;</w:t>
+              <w:t>Informações sobre as condições e meio ambiente de trabalho.</w:t>
             </w:r>
           </w:p>
           <w:p>
@@ -1587,7 +1663,7 @@
               </w:numPr>
             </w:pPr>
             <w:r>
-              <w:t>Equipamentos de guindar, gruas e elevadores;</w:t>
+              <w:t>Riscos inerentes a sua função.</w:t>
             </w:r>
           </w:p>
           <w:p>
@@ -1599,7 +1675,7 @@
               </w:numPr>
             </w:pPr>
             <w:r>
-              <w:t>Andaimes e plataforma de trabalho;</w:t>
+              <w:t>Uso adequado dos Equipamentos de Proteção Individual - EPI.</w:t>
             </w:r>
           </w:p>
           <w:p>
@@ -1611,144 +1687,7 @@
               </w:numPr>
             </w:pPr>
             <w:r>
-              <w:t>Cadeira suspensa;</w:t>
-            </w:r>
-          </w:p>
-        </w:tc>
-        <w:tc>
-          <w:tcPr>
-            <w:tcW w:w="7286" w:type="dxa"/>
-          </w:tcPr>
-          <w:p>
-            <w:pPr>
-              <w:pStyle w:val="PargrafodaLista"/>
-              <w:numPr>
-                <w:ilvl w:val="0"/>
-                <w:numId w:val="3"/>
-              </w:numPr>
-            </w:pPr>
-            <w:r>
-              <w:t>Riscos nas atividades de alvenaria, revestimentos e acabamentos;</w:t>
-            </w:r>
-          </w:p>
-          <w:p>
-            <w:pPr>
-              <w:pStyle w:val="PargrafodaLista"/>
-              <w:numPr>
-                <w:ilvl w:val="0"/>
-                <w:numId w:val="3"/>
-              </w:numPr>
-            </w:pPr>
-            <w:r>
-              <w:t>Instalações elétricas;</w:t>
-            </w:r>
-          </w:p>
-          <w:p>
-            <w:pPr>
-              <w:pStyle w:val="PargrafodaLista"/>
-              <w:numPr>
-                <w:ilvl w:val="0"/>
-                <w:numId w:val="3"/>
-              </w:numPr>
-            </w:pPr>
-            <w:r>
-              <w:t>Armazenamento e estocagem de materiais;</w:t>
-            </w:r>
-          </w:p>
-          <w:p>
-            <w:pPr>
-              <w:pStyle w:val="PargrafodaLista"/>
-              <w:numPr>
-                <w:ilvl w:val="0"/>
-                <w:numId w:val="3"/>
-              </w:numPr>
-            </w:pPr>
-            <w:r>
-              <w:t>Proteção contra incêndio;</w:t>
-            </w:r>
-          </w:p>
-          <w:p>
-            <w:pPr>
-              <w:pStyle w:val="PargrafodaLista"/>
-              <w:numPr>
-                <w:ilvl w:val="0"/>
-                <w:numId w:val="3"/>
-              </w:numPr>
-            </w:pPr>
-            <w:r>
-              <w:t>Sinalização de segurança;</w:t>
-            </w:r>
-          </w:p>
-          <w:p>
-            <w:pPr>
-              <w:pStyle w:val="PargrafodaLista"/>
-              <w:numPr>
-                <w:ilvl w:val="0"/>
-                <w:numId w:val="3"/>
-              </w:numPr>
-            </w:pPr>
-            <w:r>
-              <w:t>Acidente fatal;</w:t>
-            </w:r>
-          </w:p>
-          <w:p>
-            <w:pPr>
-              <w:pStyle w:val="PargrafodaLista"/>
-              <w:numPr>
-                <w:ilvl w:val="0"/>
-                <w:numId w:val="3"/>
-              </w:numPr>
-            </w:pPr>
-            <w:r>
-              <w:t>Serviços em flutuantes;</w:t>
-            </w:r>
-          </w:p>
-          <w:p>
-            <w:pPr>
-              <w:pStyle w:val="PargrafodaLista"/>
-              <w:numPr>
-                <w:ilvl w:val="0"/>
-                <w:numId w:val="3"/>
-              </w:numPr>
-            </w:pPr>
-            <w:r>
-              <w:t>Uso adequado dos equipamentos de proteção individual – EPI;</w:t>
-            </w:r>
-          </w:p>
-          <w:p>
-            <w:pPr>
-              <w:pStyle w:val="PargrafodaLista"/>
-              <w:numPr>
-                <w:ilvl w:val="0"/>
-                <w:numId w:val="3"/>
-              </w:numPr>
-            </w:pPr>
-            <w:r>
-              <w:t>Informações sobre os equipamentos de proteção coletiva – EPC, existentes no canteiro de obras;</w:t>
-            </w:r>
-          </w:p>
-          <w:p>
-            <w:pPr>
-              <w:pStyle w:val="PargrafodaLista"/>
-              <w:numPr>
-                <w:ilvl w:val="0"/>
-                <w:numId w:val="3"/>
-              </w:numPr>
-            </w:pPr>
-            <w:r>
-              <w:t>O PGR no canteiro de obras;</w:t>
-            </w:r>
-          </w:p>
-          <w:p>
-            <w:pPr>
-              <w:pStyle w:val="PargrafodaLista"/>
-              <w:numPr>
-                <w:ilvl w:val="0"/>
-                <w:numId w:val="3"/>
-              </w:numPr>
-            </w:pPr>
-            <w:r>
-              <w:t>Avaliação final.</w:t>
+              <w:t>Informações sobre os Equipamentos de Proteção Coletiva - EPC, existentes no canteiro de obra.</w:t>
             </w:r>
           </w:p>
         </w:tc>
@@ -2929,7 +2868,6 @@
   <w:style w:type="character" w:default="1" w:styleId="Fontepargpadro">
     <w:name w:val="Default Paragraph Font"/>
     <w:uiPriority w:val="1"/>
-    <w:semiHidden/>
     <w:unhideWhenUsed/>
   </w:style>
   <w:style w:type="table" w:default="1" w:styleId="Tabelanormal">

</xml_diff>